<commit_message>
Updated code for increased reproducibility after feedback from professor. Changed name of updated dataframe. Moved averages to actually inline code.
</commit_message>
<xml_diff>
--- a/Code/HW1_Code.docx
+++ b/Code/HW1_Code.docx
@@ -23,7 +23,7 @@
         <w:pStyle w:val="Date"/>
       </w:pPr>
       <w:r>
-        <w:t xml:space="preserve">2026-09-09</w:t>
+        <w:t xml:space="preserve">2026-09-20</w:t>
       </w:r>
     </w:p>
     <w:p>
@@ -43,7 +43,7 @@
         <w:rPr>
           <w:rStyle w:val="NormalTok"/>
         </w:rPr>
-        <w:t xml:space="preserve">df </w:t>
+        <w:t xml:space="preserve">df_updated </w:t>
       </w:r>
       <w:r>
         <w:rPr>
@@ -1214,7 +1214,7 @@
         <w:rPr>
           <w:rStyle w:val="NormalTok"/>
         </w:rPr>
-        <w:t xml:space="preserve">(df, </w:t>
+        <w:t xml:space="preserve">(df_updated, </w:t>
       </w:r>
       <w:r>
         <w:rPr>
@@ -1434,7 +1434,15 @@
         <w:pStyle w:val="BodyText"/>
       </w:pPr>
       <w:r>
-        <w:t xml:space="preserve">The mean IQ was</w:t>
+        <w:t xml:space="preserve">The mean IQ was 98.3387097.</w:t>
+      </w:r>
+    </w:p>
+    <w:p>
+      <w:pPr>
+        <w:pStyle w:val="BodyText"/>
+      </w:pPr>
+      <w:r>
+        <w:t xml:space="preserve">The average IQ for those living Near the smelter was 89.1929825. The average IQ for those living far from the smelter was 92.6865672.</w:t>
       </w:r>
     </w:p>
     <w:p>
@@ -1445,139 +1453,25 @@
         <w:rPr>
           <w:rStyle w:val="VerbatimChar"/>
         </w:rPr>
-        <w:t xml:space="preserve">## [1] 91.08065</w:t>
-      </w:r>
-    </w:p>
-    <w:p>
-      <w:pPr>
-        <w:pStyle w:val="FirstParagraph"/>
-      </w:pPr>
-      <w:r>
-        <w:t xml:space="preserve">The IQ by group is shown below.</w:t>
-      </w:r>
-    </w:p>
-    <w:p>
-      <w:pPr>
-        <w:pStyle w:val="SourceCode"/>
-      </w:pPr>
-      <w:r>
-        <w:rPr>
-          <w:rStyle w:val="NormalTok"/>
-        </w:rPr>
-        <w:t xml:space="preserve">df </w:t>
-      </w:r>
-      <w:r>
-        <w:rPr>
-          <w:rStyle w:val="SpecialCharTok"/>
-        </w:rPr>
-        <w:t xml:space="preserve">%&gt;%</w:t>
+        <w:t xml:space="preserve">## # A tibble: 2 × 2</w:t>
       </w:r>
       <w:r>
         <w:br/>
       </w:r>
       <w:r>
         <w:rPr>
-          <w:rStyle w:val="NormalTok"/>
-        </w:rPr>
-        <w:t xml:space="preserve">  </w:t>
-      </w:r>
-      <w:r>
-        <w:rPr>
-          <w:rStyle w:val="FunctionTok"/>
-        </w:rPr>
-        <w:t xml:space="preserve">group_by</w:t>
-      </w:r>
-      <w:r>
-        <w:rPr>
-          <w:rStyle w:val="NormalTok"/>
-        </w:rPr>
-        <w:t xml:space="preserve">(Smelter) </w:t>
-      </w:r>
-      <w:r>
-        <w:rPr>
-          <w:rStyle w:val="SpecialCharTok"/>
-        </w:rPr>
-        <w:t xml:space="preserve">%&gt;%</w:t>
+          <w:rStyle w:val="VerbatimChar"/>
+        </w:rPr>
+        <w:t xml:space="preserve">##   Smelter mean_IQ</w:t>
       </w:r>
       <w:r>
         <w:br/>
       </w:r>
       <w:r>
         <w:rPr>
-          <w:rStyle w:val="NormalTok"/>
-        </w:rPr>
-        <w:t xml:space="preserve">  </w:t>
-      </w:r>
-      <w:r>
-        <w:rPr>
-          <w:rStyle w:val="FunctionTok"/>
-        </w:rPr>
-        <w:t xml:space="preserve">summarise</w:t>
-      </w:r>
-      <w:r>
-        <w:rPr>
-          <w:rStyle w:val="NormalTok"/>
-        </w:rPr>
-        <w:t xml:space="preserve">(</w:t>
-      </w:r>
-      <w:r>
-        <w:rPr>
-          <w:rStyle w:val="AttributeTok"/>
-        </w:rPr>
-        <w:t xml:space="preserve">mean_IQ =</w:t>
-      </w:r>
-      <w:r>
-        <w:rPr>
-          <w:rStyle w:val="NormalTok"/>
-        </w:rPr>
-        <w:t xml:space="preserve"> </w:t>
-      </w:r>
-      <w:r>
-        <w:rPr>
-          <w:rStyle w:val="FunctionTok"/>
-        </w:rPr>
-        <w:t xml:space="preserve">mean</w:t>
-      </w:r>
-      <w:r>
-        <w:rPr>
-          <w:rStyle w:val="NormalTok"/>
-        </w:rPr>
-        <w:t xml:space="preserve">(IQ, </w:t>
-      </w:r>
-      <w:r>
-        <w:rPr>
-          <w:rStyle w:val="AttributeTok"/>
-        </w:rPr>
-        <w:t xml:space="preserve">na.rm =</w:t>
-      </w:r>
-      <w:r>
-        <w:rPr>
-          <w:rStyle w:val="NormalTok"/>
-        </w:rPr>
-        <w:t xml:space="preserve"> </w:t>
-      </w:r>
-      <w:r>
-        <w:rPr>
-          <w:rStyle w:val="ConstantTok"/>
-        </w:rPr>
-        <w:t xml:space="preserve">TRUE</w:t>
-      </w:r>
-      <w:r>
-        <w:rPr>
-          <w:rStyle w:val="NormalTok"/>
-        </w:rPr>
-        <w:t xml:space="preserve">))</w:t>
-      </w:r>
-    </w:p>
-    <w:p>
-      <w:pPr>
-        <w:pStyle w:val="SourceCode"/>
-      </w:pPr>
-      <w:r>
-        <w:rPr>
           <w:rStyle w:val="VerbatimChar"/>
         </w:rPr>
-        <w:t xml:space="preserve">## # A tibble: 2 × 2</w:t>
+        <w:t xml:space="preserve">##   &lt;chr&gt;     &lt;dbl&gt;</w:t>
       </w:r>
       <w:r>
         <w:br/>
@@ -1586,7 +1480,7 @@
         <w:rPr>
           <w:rStyle w:val="VerbatimChar"/>
         </w:rPr>
-        <w:t xml:space="preserve">##   Smelter mean_IQ</w:t>
+        <w:t xml:space="preserve">## 1 Far        92.7</w:t>
       </w:r>
       <w:r>
         <w:br/>
@@ -1595,36 +1489,7 @@
         <w:rPr>
           <w:rStyle w:val="VerbatimChar"/>
         </w:rPr>
-        <w:t xml:space="preserve">##   &lt;chr&gt;     &lt;dbl&gt;</w:t>
-      </w:r>
-      <w:r>
-        <w:br/>
-      </w:r>
-      <w:r>
-        <w:rPr>
-          <w:rStyle w:val="VerbatimChar"/>
-        </w:rPr>
-        <w:t xml:space="preserve">## 1 Far        92.7</w:t>
-      </w:r>
-      <w:r>
-        <w:br/>
-      </w:r>
-      <w:r>
-        <w:rPr>
-          <w:rStyle w:val="VerbatimChar"/>
-        </w:rPr>
         <w:t xml:space="preserve">## 2 Near       89.2</w:t>
-      </w:r>
-    </w:p>
-    <w:p>
-      <w:pPr>
-        <w:pStyle w:val="SourceCode"/>
-      </w:pPr>
-      <w:r>
-        <w:rPr>
-          <w:rStyle w:val="CommentTok"/>
-        </w:rPr>
-        <w:t xml:space="preserve">#A little ChatGPT help here to remember the group_by. I didn't use R all summer! I'm rusty!</w:t>
       </w:r>
     </w:p>
     <w:p>

</xml_diff>